<commit_message>
Dokumentacija: Specifikacija zahteva, fix: Pogresan datum
</commit_message>
<xml_diff>
--- a/Dokumentacija/D04_Spec_Zahteva.docx
+++ b/Dokumentacija/D04_Spec_Zahteva.docx
@@ -256,13 +256,31 @@
               <w:rPr>
                 <w:lang w:val="sr-Latn-CS"/>
               </w:rPr>
-              <w:t>22</w:t>
+              <w:t>10</w:t>
             </w:r>
             <w:r>
               <w:rPr>
                 <w:lang w:val="sr-Latn-CS"/>
               </w:rPr>
-              <w:t>.03.2007</w:t>
+              <w:t>.0</w:t>
+            </w:r>
+            <w:r>
+              <w:rPr>
+                <w:lang w:val="sr-Latn-CS"/>
+              </w:rPr>
+              <w:t>5</w:t>
+            </w:r>
+            <w:r>
+              <w:rPr>
+                <w:lang w:val="sr-Latn-CS"/>
+              </w:rPr>
+              <w:t>.20</w:t>
+            </w:r>
+            <w:r>
+              <w:rPr>
+                <w:lang w:val="sr-Latn-CS"/>
+              </w:rPr>
+              <w:t>26</w:t>
             </w:r>
             <w:r>
               <w:rPr>
@@ -4518,347 +4536,14 @@
         </w:rPr>
       </w:pPr>
       <w:r>
-        <w:t xml:space="preserve">Customer </w:t>
-      </w:r>
-      <w:proofErr w:type="spellStart"/>
-      <w:r>
-        <w:t>predstavlja</w:t>
-      </w:r>
-      <w:proofErr w:type="spellEnd"/>
+        <w:t>Customer predstavlja osnovni profil korisnika sistema SupportDesk koji koristi platformu u cilju prijavljivanja problema i komunikacije sa korisničkom podrškom. Korisnik ovog tipa može kreirati nove tikete, pregledati status svojih zahteva i razmenjivati poruke sa agentima podrške u okviru dodeljenih tiketa.</w:t>
+      </w:r>
       <w:r>
         <w:t xml:space="preserve"> </w:t>
       </w:r>
-      <w:proofErr w:type="spellStart"/>
-      <w:r>
-        <w:t>osnovni</w:t>
-      </w:r>
-      <w:proofErr w:type="spellEnd"/>
-      <w:r>
-        <w:t xml:space="preserve"> </w:t>
-      </w:r>
-      <w:proofErr w:type="spellStart"/>
-      <w:r>
-        <w:t>profil</w:t>
-      </w:r>
-      <w:proofErr w:type="spellEnd"/>
-      <w:r>
-        <w:t xml:space="preserve"> </w:t>
-      </w:r>
-      <w:proofErr w:type="spellStart"/>
-      <w:r>
-        <w:t>korisnika</w:t>
-      </w:r>
-      <w:proofErr w:type="spellEnd"/>
-      <w:r>
-        <w:t xml:space="preserve"> </w:t>
-      </w:r>
-      <w:proofErr w:type="spellStart"/>
-      <w:r>
-        <w:t>sistema</w:t>
-      </w:r>
-      <w:proofErr w:type="spellEnd"/>
-      <w:r>
-        <w:t xml:space="preserve"> </w:t>
-      </w:r>
-      <w:proofErr w:type="spellStart"/>
-      <w:r>
-        <w:t>SupportDesk</w:t>
-      </w:r>
-      <w:proofErr w:type="spellEnd"/>
-      <w:r>
-        <w:t xml:space="preserve"> koji </w:t>
-      </w:r>
-      <w:proofErr w:type="spellStart"/>
-      <w:r>
-        <w:t>koristi</w:t>
-      </w:r>
-      <w:proofErr w:type="spellEnd"/>
-      <w:r>
-        <w:t xml:space="preserve"> </w:t>
-      </w:r>
-      <w:proofErr w:type="spellStart"/>
-      <w:r>
-        <w:t>platformu</w:t>
-      </w:r>
-      <w:proofErr w:type="spellEnd"/>
-      <w:r>
-        <w:t xml:space="preserve"> u </w:t>
-      </w:r>
-      <w:proofErr w:type="spellStart"/>
-      <w:r>
-        <w:t>cilju</w:t>
-      </w:r>
-      <w:proofErr w:type="spellEnd"/>
-      <w:r>
-        <w:t xml:space="preserve"> </w:t>
-      </w:r>
-      <w:proofErr w:type="spellStart"/>
-      <w:r>
-        <w:t>prijavljivanja</w:t>
-      </w:r>
-      <w:proofErr w:type="spellEnd"/>
-      <w:r>
-        <w:t xml:space="preserve"> </w:t>
-      </w:r>
-      <w:proofErr w:type="spellStart"/>
-      <w:r>
-        <w:t>problema</w:t>
-      </w:r>
-      <w:proofErr w:type="spellEnd"/>
-      <w:r>
-        <w:t xml:space="preserve"> </w:t>
-      </w:r>
-      <w:proofErr w:type="spellStart"/>
-      <w:r>
-        <w:t>i</w:t>
-      </w:r>
-      <w:proofErr w:type="spellEnd"/>
-      <w:r>
-        <w:t xml:space="preserve"> </w:t>
-      </w:r>
-      <w:proofErr w:type="spellStart"/>
-      <w:r>
-        <w:t>komunikacije</w:t>
-      </w:r>
-      <w:proofErr w:type="spellEnd"/>
-      <w:r>
-        <w:t xml:space="preserve"> </w:t>
-      </w:r>
-      <w:proofErr w:type="spellStart"/>
-      <w:r>
-        <w:t>sa</w:t>
-      </w:r>
-      <w:proofErr w:type="spellEnd"/>
-      <w:r>
-        <w:t xml:space="preserve"> </w:t>
-      </w:r>
-      <w:proofErr w:type="spellStart"/>
-      <w:r>
-        <w:t>korisničkom</w:t>
-      </w:r>
-      <w:proofErr w:type="spellEnd"/>
-      <w:r>
-        <w:t xml:space="preserve"> </w:t>
-      </w:r>
-      <w:proofErr w:type="spellStart"/>
-      <w:r>
-        <w:t>podrškom</w:t>
-      </w:r>
-      <w:proofErr w:type="spellEnd"/>
-      <w:r>
-        <w:t xml:space="preserve">. </w:t>
-      </w:r>
-      <w:proofErr w:type="spellStart"/>
-      <w:r>
-        <w:t>Korisnik</w:t>
-      </w:r>
-      <w:proofErr w:type="spellEnd"/>
-      <w:r>
-        <w:t xml:space="preserve"> </w:t>
-      </w:r>
-      <w:proofErr w:type="spellStart"/>
-      <w:r>
-        <w:t>ovog</w:t>
-      </w:r>
-      <w:proofErr w:type="spellEnd"/>
-      <w:r>
-        <w:t xml:space="preserve"> </w:t>
-      </w:r>
-      <w:proofErr w:type="spellStart"/>
-      <w:r>
-        <w:t>tipa</w:t>
-      </w:r>
-      <w:proofErr w:type="spellEnd"/>
-      <w:r>
-        <w:t xml:space="preserve"> </w:t>
-      </w:r>
-      <w:proofErr w:type="spellStart"/>
-      <w:r>
-        <w:t>može</w:t>
-      </w:r>
-      <w:proofErr w:type="spellEnd"/>
-      <w:r>
-        <w:t xml:space="preserve"> </w:t>
-      </w:r>
-      <w:proofErr w:type="spellStart"/>
-      <w:r>
-        <w:t>kreirati</w:t>
-      </w:r>
-      <w:proofErr w:type="spellEnd"/>
-      <w:r>
-        <w:t xml:space="preserve"> </w:t>
-      </w:r>
-      <w:proofErr w:type="spellStart"/>
-      <w:r>
-        <w:t>nove</w:t>
-      </w:r>
-      <w:proofErr w:type="spellEnd"/>
-      <w:r>
-        <w:t xml:space="preserve"> </w:t>
-      </w:r>
-      <w:proofErr w:type="spellStart"/>
-      <w:r>
-        <w:t>tikete</w:t>
-      </w:r>
-      <w:proofErr w:type="spellEnd"/>
-      <w:r>
-        <w:t xml:space="preserve">, </w:t>
-      </w:r>
-      <w:proofErr w:type="spellStart"/>
-      <w:r>
-        <w:t>pregledati</w:t>
-      </w:r>
-      <w:proofErr w:type="spellEnd"/>
-      <w:r>
-        <w:t xml:space="preserve"> status </w:t>
-      </w:r>
-      <w:proofErr w:type="spellStart"/>
-      <w:r>
-        <w:t>svojih</w:t>
-      </w:r>
-      <w:proofErr w:type="spellEnd"/>
-      <w:r>
-        <w:t xml:space="preserve"> </w:t>
-      </w:r>
-      <w:proofErr w:type="spellStart"/>
-      <w:r>
-        <w:t>zahteva</w:t>
-      </w:r>
-      <w:proofErr w:type="spellEnd"/>
-      <w:r>
-        <w:t xml:space="preserve"> </w:t>
-      </w:r>
-      <w:proofErr w:type="spellStart"/>
-      <w:r>
-        <w:t>i</w:t>
-      </w:r>
-      <w:proofErr w:type="spellEnd"/>
-      <w:r>
-        <w:t xml:space="preserve"> </w:t>
-      </w:r>
-      <w:proofErr w:type="spellStart"/>
-      <w:r>
-        <w:t>razmenjivati</w:t>
-      </w:r>
-      <w:proofErr w:type="spellEnd"/>
-      <w:r>
-        <w:t xml:space="preserve"> </w:t>
-      </w:r>
-      <w:proofErr w:type="spellStart"/>
-      <w:r>
-        <w:t>poruke</w:t>
-      </w:r>
-      <w:proofErr w:type="spellEnd"/>
-      <w:r>
-        <w:t xml:space="preserve"> </w:t>
-      </w:r>
-      <w:proofErr w:type="spellStart"/>
-      <w:r>
-        <w:t>sa</w:t>
-      </w:r>
-      <w:proofErr w:type="spellEnd"/>
-      <w:r>
-        <w:t xml:space="preserve"> </w:t>
-      </w:r>
-      <w:proofErr w:type="spellStart"/>
-      <w:r>
-        <w:t>agentima</w:t>
-      </w:r>
-      <w:proofErr w:type="spellEnd"/>
-      <w:r>
-        <w:t xml:space="preserve"> </w:t>
-      </w:r>
-      <w:proofErr w:type="spellStart"/>
-      <w:r>
-        <w:t>podrške</w:t>
-      </w:r>
-      <w:proofErr w:type="spellEnd"/>
-      <w:r>
-        <w:t xml:space="preserve"> u </w:t>
-      </w:r>
-      <w:proofErr w:type="spellStart"/>
-      <w:r>
-        <w:t>okviru</w:t>
-      </w:r>
-      <w:proofErr w:type="spellEnd"/>
-      <w:r>
-        <w:t xml:space="preserve"> </w:t>
-      </w:r>
-      <w:proofErr w:type="spellStart"/>
-      <w:r>
-        <w:t>dodeljenih</w:t>
-      </w:r>
-      <w:proofErr w:type="spellEnd"/>
-      <w:r>
-        <w:t xml:space="preserve"> </w:t>
-      </w:r>
-      <w:proofErr w:type="spellStart"/>
-      <w:r>
-        <w:t>tiketa</w:t>
-      </w:r>
-      <w:proofErr w:type="spellEnd"/>
-      <w:r>
-        <w:t>.</w:t>
-      </w:r>
-      <w:r>
-        <w:t xml:space="preserve"> </w:t>
-      </w:r>
-      <w:r>
-        <w:t xml:space="preserve">Za </w:t>
-      </w:r>
-      <w:proofErr w:type="spellStart"/>
-      <w:r>
-        <w:t>korišćenje</w:t>
-      </w:r>
-      <w:proofErr w:type="spellEnd"/>
-      <w:r>
-        <w:t xml:space="preserve"> </w:t>
-      </w:r>
-      <w:proofErr w:type="spellStart"/>
-      <w:r>
-        <w:t>funkcionalnosti</w:t>
-      </w:r>
-      <w:proofErr w:type="spellEnd"/>
-      <w:r>
-        <w:t xml:space="preserve"> </w:t>
-      </w:r>
-      <w:proofErr w:type="spellStart"/>
-      <w:r>
-        <w:t>sistema</w:t>
-      </w:r>
-      <w:proofErr w:type="spellEnd"/>
-      <w:r>
-        <w:t xml:space="preserve"> </w:t>
-      </w:r>
-      <w:proofErr w:type="spellStart"/>
-      <w:r>
-        <w:t>potrebno</w:t>
-      </w:r>
-      <w:proofErr w:type="spellEnd"/>
-      <w:r>
-        <w:t xml:space="preserve"> je </w:t>
-      </w:r>
-      <w:proofErr w:type="spellStart"/>
-      <w:r>
-        <w:t>prethodno</w:t>
-      </w:r>
-      <w:proofErr w:type="spellEnd"/>
-      <w:r>
-        <w:t xml:space="preserve"> </w:t>
-      </w:r>
-      <w:proofErr w:type="spellStart"/>
-      <w:r>
-        <w:t>prijavljivanje</w:t>
-      </w:r>
-      <w:proofErr w:type="spellEnd"/>
-      <w:r>
-        <w:t xml:space="preserve"> </w:t>
-      </w:r>
-      <w:proofErr w:type="spellStart"/>
-      <w:r>
-        <w:t>korisnika</w:t>
-      </w:r>
-      <w:proofErr w:type="spellEnd"/>
+      <w:r>
+        <w:t>Za korišćenje funkcionalnosti sistema potrebno je prethodno prijavljivanje korisnika</w:t>
+      </w:r>
       <w:r>
         <w:rPr>
           <w:lang w:val="sr-Latn-CS"/>
@@ -5008,36 +4693,10 @@
         <w:pStyle w:val="Heading2"/>
       </w:pPr>
       <w:bookmarkStart w:id="9" w:name="_Toc229341716"/>
-      <w:proofErr w:type="spellStart"/>
-      <w:r>
-        <w:t>Pregled</w:t>
-      </w:r>
-      <w:proofErr w:type="spellEnd"/>
-      <w:r>
-        <w:t xml:space="preserve"> </w:t>
-      </w:r>
-      <w:proofErr w:type="spellStart"/>
-      <w:r>
-        <w:t>početne</w:t>
-      </w:r>
-      <w:proofErr w:type="spellEnd"/>
-      <w:r>
-        <w:t xml:space="preserve"> </w:t>
-      </w:r>
-      <w:proofErr w:type="spellStart"/>
-      <w:r>
-        <w:t>stranice</w:t>
-      </w:r>
-      <w:proofErr w:type="spellEnd"/>
-      <w:r>
-        <w:t xml:space="preserve"> </w:t>
-      </w:r>
-      <w:proofErr w:type="spellStart"/>
-      <w:r>
-        <w:t>sistema</w:t>
+      <w:r>
+        <w:t>Pregled početne stranice sistema</w:t>
       </w:r>
       <w:bookmarkEnd w:id="9"/>
-      <w:proofErr w:type="spellEnd"/>
     </w:p>
     <w:p>
       <w:pPr>
@@ -5287,28 +4946,10 @@
         </w:rPr>
       </w:pPr>
       <w:bookmarkStart w:id="10" w:name="_Toc229341717"/>
-      <w:proofErr w:type="spellStart"/>
-      <w:r>
-        <w:t>Promena</w:t>
-      </w:r>
-      <w:proofErr w:type="spellEnd"/>
-      <w:r>
-        <w:t xml:space="preserve"> </w:t>
-      </w:r>
-      <w:proofErr w:type="spellStart"/>
-      <w:r>
-        <w:t>teme</w:t>
-      </w:r>
-      <w:proofErr w:type="spellEnd"/>
-      <w:r>
-        <w:t xml:space="preserve"> </w:t>
-      </w:r>
-      <w:proofErr w:type="spellStart"/>
-      <w:r>
-        <w:t>prikaza</w:t>
+      <w:r>
+        <w:t>Promena teme prikaza</w:t>
       </w:r>
       <w:bookmarkEnd w:id="10"/>
-      <w:proofErr w:type="spellEnd"/>
     </w:p>
     <w:p>
       <w:pPr>
@@ -6154,29 +5795,8 @@
         </w:rPr>
       </w:pPr>
       <w:bookmarkStart w:id="13" w:name="_Toc229341720"/>
-      <w:proofErr w:type="spellStart"/>
-      <w:r>
-        <w:t>Pregled</w:t>
-      </w:r>
-      <w:proofErr w:type="spellEnd"/>
-      <w:r>
-        <w:t xml:space="preserve"> </w:t>
-      </w:r>
-      <w:proofErr w:type="spellStart"/>
-      <w:r>
-        <w:t>klijentske</w:t>
-      </w:r>
-      <w:proofErr w:type="spellEnd"/>
-      <w:r>
-        <w:t xml:space="preserve"> </w:t>
-      </w:r>
-      <w:proofErr w:type="spellStart"/>
-      <w:r>
-        <w:t>kontrolne</w:t>
-      </w:r>
-      <w:proofErr w:type="spellEnd"/>
-      <w:r>
-        <w:t xml:space="preserve"> table</w:t>
+      <w:r>
+        <w:t>Pregled klijentske kontrolne table</w:t>
       </w:r>
       <w:bookmarkEnd w:id="13"/>
     </w:p>
@@ -6749,52 +6369,10 @@
         </w:rPr>
       </w:pPr>
       <w:bookmarkStart w:id="15" w:name="_Toc229341722"/>
-      <w:proofErr w:type="spellStart"/>
-      <w:r>
-        <w:t>Pregled</w:t>
-      </w:r>
-      <w:proofErr w:type="spellEnd"/>
-      <w:r>
-        <w:t xml:space="preserve"> </w:t>
-      </w:r>
-      <w:proofErr w:type="spellStart"/>
-      <w:r>
-        <w:t>detalja</w:t>
-      </w:r>
-      <w:proofErr w:type="spellEnd"/>
-      <w:r>
-        <w:t xml:space="preserve"> </w:t>
-      </w:r>
-      <w:proofErr w:type="spellStart"/>
-      <w:r>
-        <w:t>tiketa</w:t>
-      </w:r>
-      <w:proofErr w:type="spellEnd"/>
-      <w:r>
-        <w:t xml:space="preserve"> </w:t>
-      </w:r>
-      <w:proofErr w:type="spellStart"/>
-      <w:r>
-        <w:t>od</w:t>
-      </w:r>
-      <w:proofErr w:type="spellEnd"/>
-      <w:r>
-        <w:t xml:space="preserve"> </w:t>
-      </w:r>
-      <w:proofErr w:type="spellStart"/>
-      <w:r>
-        <w:t>strane</w:t>
-      </w:r>
-      <w:proofErr w:type="spellEnd"/>
-      <w:r>
-        <w:t xml:space="preserve"> </w:t>
-      </w:r>
-      <w:proofErr w:type="spellStart"/>
-      <w:r>
-        <w:t>klijenta</w:t>
+      <w:r>
+        <w:t>Pregled detalja tiketa od strane klijenta</w:t>
       </w:r>
       <w:bookmarkEnd w:id="15"/>
-      <w:proofErr w:type="spellEnd"/>
     </w:p>
     <w:p>
       <w:pPr>
@@ -7030,44 +6608,10 @@
         </w:rPr>
       </w:pPr>
       <w:bookmarkStart w:id="16" w:name="_Toc229341723"/>
-      <w:proofErr w:type="spellStart"/>
-      <w:r>
-        <w:t>Slanje</w:t>
-      </w:r>
-      <w:proofErr w:type="spellEnd"/>
-      <w:r>
-        <w:t xml:space="preserve"> </w:t>
-      </w:r>
-      <w:proofErr w:type="spellStart"/>
-      <w:r>
-        <w:t>poruke</w:t>
-      </w:r>
-      <w:proofErr w:type="spellEnd"/>
-      <w:r>
-        <w:t xml:space="preserve"> u </w:t>
-      </w:r>
-      <w:proofErr w:type="spellStart"/>
-      <w:r>
-        <w:t>tiketu</w:t>
-      </w:r>
-      <w:proofErr w:type="spellEnd"/>
-      <w:r>
-        <w:t xml:space="preserve"> od </w:t>
-      </w:r>
-      <w:proofErr w:type="spellStart"/>
-      <w:r>
-        <w:t>strane</w:t>
-      </w:r>
-      <w:proofErr w:type="spellEnd"/>
-      <w:r>
-        <w:t xml:space="preserve"> </w:t>
-      </w:r>
-      <w:proofErr w:type="spellStart"/>
-      <w:r>
-        <w:t>klijenta</w:t>
+      <w:r>
+        <w:t>Slanje poruke u tiketu od strane klijenta</w:t>
       </w:r>
       <w:bookmarkEnd w:id="16"/>
-      <w:proofErr w:type="spellEnd"/>
     </w:p>
     <w:p>
       <w:pPr>
@@ -7318,28 +6862,10 @@
         </w:rPr>
       </w:pPr>
       <w:bookmarkStart w:id="17" w:name="_Toc229341724"/>
-      <w:proofErr w:type="spellStart"/>
-      <w:r>
-        <w:t>Ocenjivanje</w:t>
-      </w:r>
-      <w:proofErr w:type="spellEnd"/>
-      <w:r>
-        <w:t xml:space="preserve"> </w:t>
-      </w:r>
-      <w:proofErr w:type="spellStart"/>
-      <w:r>
-        <w:t>rešenja</w:t>
-      </w:r>
-      <w:proofErr w:type="spellEnd"/>
-      <w:r>
-        <w:t xml:space="preserve"> </w:t>
-      </w:r>
-      <w:proofErr w:type="spellStart"/>
-      <w:r>
-        <w:t>tiketa</w:t>
+      <w:r>
+        <w:t>Ocenjivanje rešenja tiketa</w:t>
       </w:r>
       <w:bookmarkEnd w:id="17"/>
-      <w:proofErr w:type="spellEnd"/>
     </w:p>
     <w:p>
       <w:pPr>
@@ -7599,29 +7125,8 @@
         </w:rPr>
       </w:pPr>
       <w:bookmarkStart w:id="18" w:name="_Toc229341725"/>
-      <w:proofErr w:type="spellStart"/>
-      <w:r>
-        <w:t>Pregled</w:t>
-      </w:r>
-      <w:proofErr w:type="spellEnd"/>
-      <w:r>
-        <w:t xml:space="preserve"> </w:t>
-      </w:r>
-      <w:proofErr w:type="spellStart"/>
-      <w:r>
-        <w:t>administratorske</w:t>
-      </w:r>
-      <w:proofErr w:type="spellEnd"/>
-      <w:r>
-        <w:t xml:space="preserve"> </w:t>
-      </w:r>
-      <w:proofErr w:type="spellStart"/>
-      <w:r>
-        <w:t>kontrolne</w:t>
-      </w:r>
-      <w:proofErr w:type="spellEnd"/>
-      <w:r>
-        <w:t xml:space="preserve"> table</w:t>
+      <w:r>
+        <w:t>Pregled administratorske kontrolne table</w:t>
       </w:r>
       <w:bookmarkEnd w:id="18"/>
     </w:p>
@@ -7884,36 +7389,10 @@
         </w:rPr>
       </w:pPr>
       <w:bookmarkStart w:id="19" w:name="_Toc229341726"/>
-      <w:proofErr w:type="spellStart"/>
-      <w:r>
-        <w:t>Pregled</w:t>
-      </w:r>
-      <w:proofErr w:type="spellEnd"/>
-      <w:r>
-        <w:t xml:space="preserve"> </w:t>
-      </w:r>
-      <w:proofErr w:type="spellStart"/>
-      <w:r>
-        <w:t>spiska</w:t>
-      </w:r>
-      <w:proofErr w:type="spellEnd"/>
-      <w:r>
-        <w:t xml:space="preserve"> </w:t>
-      </w:r>
-      <w:proofErr w:type="spellStart"/>
-      <w:r>
-        <w:t>tiketa</w:t>
-      </w:r>
-      <w:proofErr w:type="spellEnd"/>
-      <w:r>
-        <w:t xml:space="preserve"> za </w:t>
-      </w:r>
-      <w:proofErr w:type="spellStart"/>
-      <w:r>
-        <w:t>podršku</w:t>
+      <w:r>
+        <w:t>Pregled spiska tiketa za podršku</w:t>
       </w:r>
       <w:bookmarkEnd w:id="19"/>
-      <w:proofErr w:type="spellEnd"/>
     </w:p>
     <w:p>
       <w:pPr>
@@ -8213,52 +7692,10 @@
         </w:rPr>
       </w:pPr>
       <w:bookmarkStart w:id="20" w:name="_Toc229341727"/>
-      <w:proofErr w:type="spellStart"/>
-      <w:r>
-        <w:t>Pregled</w:t>
-      </w:r>
-      <w:proofErr w:type="spellEnd"/>
-      <w:r>
-        <w:t xml:space="preserve"> </w:t>
-      </w:r>
-      <w:proofErr w:type="spellStart"/>
-      <w:r>
-        <w:t>detalja</w:t>
-      </w:r>
-      <w:proofErr w:type="spellEnd"/>
-      <w:r>
-        <w:t xml:space="preserve"> </w:t>
-      </w:r>
-      <w:proofErr w:type="spellStart"/>
-      <w:r>
-        <w:t>tiketa</w:t>
-      </w:r>
-      <w:proofErr w:type="spellEnd"/>
-      <w:r>
-        <w:t xml:space="preserve"> </w:t>
-      </w:r>
-      <w:proofErr w:type="spellStart"/>
-      <w:r>
-        <w:t>od</w:t>
-      </w:r>
-      <w:proofErr w:type="spellEnd"/>
-      <w:r>
-        <w:t xml:space="preserve"> </w:t>
-      </w:r>
-      <w:proofErr w:type="spellStart"/>
-      <w:r>
-        <w:t>strane</w:t>
-      </w:r>
-      <w:proofErr w:type="spellEnd"/>
-      <w:r>
-        <w:t xml:space="preserve"> </w:t>
-      </w:r>
-      <w:proofErr w:type="spellStart"/>
-      <w:r>
-        <w:t>podrške</w:t>
+      <w:r>
+        <w:t>Pregled detalja tiketa od strane podrške</w:t>
       </w:r>
       <w:bookmarkEnd w:id="20"/>
-      <w:proofErr w:type="spellEnd"/>
     </w:p>
     <w:p>
       <w:pPr>
@@ -8521,36 +7958,10 @@
         </w:rPr>
       </w:pPr>
       <w:bookmarkStart w:id="21" w:name="_Toc229341728"/>
-      <w:proofErr w:type="spellStart"/>
-      <w:r>
-        <w:t>Automatsko</w:t>
-      </w:r>
-      <w:proofErr w:type="spellEnd"/>
-      <w:r>
-        <w:t xml:space="preserve"> </w:t>
-      </w:r>
-      <w:proofErr w:type="spellStart"/>
-      <w:r>
-        <w:t>dodeljivanje</w:t>
-      </w:r>
-      <w:proofErr w:type="spellEnd"/>
-      <w:r>
-        <w:t xml:space="preserve"> </w:t>
-      </w:r>
-      <w:proofErr w:type="spellStart"/>
-      <w:r>
-        <w:t>tiketa</w:t>
-      </w:r>
-      <w:proofErr w:type="spellEnd"/>
-      <w:r>
-        <w:t xml:space="preserve"> </w:t>
-      </w:r>
-      <w:proofErr w:type="spellStart"/>
-      <w:r>
-        <w:t>agentu</w:t>
+      <w:r>
+        <w:t>Automatsko dodeljivanje tiketa agentu</w:t>
       </w:r>
       <w:bookmarkEnd w:id="21"/>
-      <w:proofErr w:type="spellEnd"/>
     </w:p>
     <w:p>
       <w:pPr>
@@ -8814,28 +8225,10 @@
         </w:rPr>
       </w:pPr>
       <w:bookmarkStart w:id="22" w:name="_Toc229341729"/>
-      <w:proofErr w:type="spellStart"/>
-      <w:r>
-        <w:t>Slanje</w:t>
-      </w:r>
-      <w:proofErr w:type="spellEnd"/>
-      <w:r>
-        <w:t xml:space="preserve"> </w:t>
-      </w:r>
-      <w:proofErr w:type="spellStart"/>
-      <w:r>
-        <w:t>odgovora</w:t>
-      </w:r>
-      <w:proofErr w:type="spellEnd"/>
-      <w:r>
-        <w:t xml:space="preserve"> </w:t>
-      </w:r>
-      <w:proofErr w:type="spellStart"/>
-      <w:r>
-        <w:t>klijentu</w:t>
+      <w:r>
+        <w:t>Slanje odgovora klijentu</w:t>
       </w:r>
       <w:bookmarkEnd w:id="22"/>
-      <w:proofErr w:type="spellEnd"/>
     </w:p>
     <w:p>
       <w:pPr>
@@ -9086,28 +8479,10 @@
         </w:rPr>
       </w:pPr>
       <w:bookmarkStart w:id="23" w:name="_Toc229341730"/>
-      <w:proofErr w:type="spellStart"/>
-      <w:r>
-        <w:t>Korišćenje</w:t>
-      </w:r>
-      <w:proofErr w:type="spellEnd"/>
-      <w:r>
-        <w:t xml:space="preserve"> </w:t>
-      </w:r>
-      <w:proofErr w:type="spellStart"/>
-      <w:r>
-        <w:t>šablonskog</w:t>
-      </w:r>
-      <w:proofErr w:type="spellEnd"/>
-      <w:r>
-        <w:t xml:space="preserve"> </w:t>
-      </w:r>
-      <w:proofErr w:type="spellStart"/>
-      <w:r>
-        <w:t>odgovora</w:t>
+      <w:r>
+        <w:t>Korišćenje šablonskog odgovora</w:t>
       </w:r>
       <w:bookmarkEnd w:id="23"/>
-      <w:proofErr w:type="spellEnd"/>
     </w:p>
     <w:p>
       <w:pPr>
@@ -9371,20 +8746,10 @@
         </w:rPr>
       </w:pPr>
       <w:bookmarkStart w:id="24" w:name="_Toc229341731"/>
-      <w:proofErr w:type="spellStart"/>
-      <w:r>
-        <w:t>Dodavanje</w:t>
-      </w:r>
-      <w:proofErr w:type="spellEnd"/>
-      <w:r>
-        <w:t xml:space="preserve"> interne </w:t>
-      </w:r>
-      <w:proofErr w:type="spellStart"/>
-      <w:r>
-        <w:t>beleške</w:t>
+      <w:r>
+        <w:t>Dodavanje interne beleške</w:t>
       </w:r>
       <w:bookmarkEnd w:id="24"/>
-      <w:proofErr w:type="spellEnd"/>
     </w:p>
     <w:p>
       <w:pPr>
@@ -9661,20 +9026,10 @@
         </w:rPr>
       </w:pPr>
       <w:bookmarkStart w:id="25" w:name="_Toc229341732"/>
-      <w:proofErr w:type="spellStart"/>
-      <w:r>
-        <w:t>Zatvaranje</w:t>
-      </w:r>
-      <w:proofErr w:type="spellEnd"/>
-      <w:r>
-        <w:t xml:space="preserve"> </w:t>
-      </w:r>
-      <w:proofErr w:type="spellStart"/>
-      <w:r>
-        <w:t>tiketa</w:t>
+      <w:r>
+        <w:t>Zatvaranje tiketa</w:t>
       </w:r>
       <w:bookmarkEnd w:id="25"/>
-      <w:proofErr w:type="spellEnd"/>
     </w:p>
     <w:p>
       <w:pPr>
@@ -9924,36 +9279,10 @@
         </w:rPr>
       </w:pPr>
       <w:bookmarkStart w:id="26" w:name="_Toc229341733"/>
-      <w:proofErr w:type="spellStart"/>
-      <w:r>
-        <w:t>Pregled</w:t>
-      </w:r>
-      <w:proofErr w:type="spellEnd"/>
-      <w:r>
-        <w:t xml:space="preserve"> </w:t>
-      </w:r>
-      <w:proofErr w:type="spellStart"/>
-      <w:r>
-        <w:t>i</w:t>
-      </w:r>
-      <w:proofErr w:type="spellEnd"/>
-      <w:r>
-        <w:t xml:space="preserve"> </w:t>
-      </w:r>
-      <w:proofErr w:type="spellStart"/>
-      <w:r>
-        <w:t>pretraga</w:t>
-      </w:r>
-      <w:proofErr w:type="spellEnd"/>
-      <w:r>
-        <w:t xml:space="preserve"> </w:t>
-      </w:r>
-      <w:proofErr w:type="spellStart"/>
-      <w:r>
-        <w:t>agenata</w:t>
+      <w:r>
+        <w:t>Pregled i pretraga agenata</w:t>
       </w:r>
       <w:bookmarkEnd w:id="26"/>
-      <w:proofErr w:type="spellEnd"/>
     </w:p>
     <w:p>
       <w:pPr>
@@ -10239,37 +9568,11 @@
         </w:rPr>
       </w:pPr>
       <w:bookmarkStart w:id="27" w:name="_Toc229341734"/>
-      <w:proofErr w:type="spellStart"/>
       <w:r>
         <w:lastRenderedPageBreak/>
-        <w:t>Generisanje</w:t>
-      </w:r>
-      <w:proofErr w:type="spellEnd"/>
-      <w:r>
-        <w:t xml:space="preserve"> </w:t>
-      </w:r>
-      <w:proofErr w:type="spellStart"/>
-      <w:r>
-        <w:t>pozivnog</w:t>
-      </w:r>
-      <w:proofErr w:type="spellEnd"/>
-      <w:r>
-        <w:t xml:space="preserve"> </w:t>
-      </w:r>
-      <w:proofErr w:type="spellStart"/>
-      <w:r>
-        <w:t>koda</w:t>
-      </w:r>
-      <w:proofErr w:type="spellEnd"/>
-      <w:r>
-        <w:t xml:space="preserve"> za </w:t>
-      </w:r>
-      <w:proofErr w:type="spellStart"/>
-      <w:r>
-        <w:t>agenta</w:t>
+        <w:t>Generisanje pozivnog koda za agenta</w:t>
       </w:r>
       <w:bookmarkEnd w:id="27"/>
-      <w:proofErr w:type="spellEnd"/>
     </w:p>
     <w:p>
       <w:pPr>
@@ -10570,20 +9873,10 @@
         <w:pStyle w:val="Heading2"/>
       </w:pPr>
       <w:bookmarkStart w:id="28" w:name="_Toc229341735"/>
-      <w:proofErr w:type="spellStart"/>
-      <w:r>
-        <w:t>Upravljanje</w:t>
-      </w:r>
-      <w:proofErr w:type="spellEnd"/>
-      <w:r>
-        <w:t xml:space="preserve"> FAQ </w:t>
-      </w:r>
-      <w:proofErr w:type="spellStart"/>
-      <w:r>
-        <w:t>pitanjima</w:t>
+      <w:r>
+        <w:t>Upravljanje FAQ pitanjima</w:t>
       </w:r>
       <w:bookmarkEnd w:id="28"/>
-      <w:proofErr w:type="spellEnd"/>
     </w:p>
     <w:p>
       <w:pPr>
@@ -10891,28 +10184,10 @@
         <w:pStyle w:val="Heading2"/>
       </w:pPr>
       <w:bookmarkStart w:id="29" w:name="_Toc229341736"/>
-      <w:proofErr w:type="spellStart"/>
-      <w:r>
-        <w:t>Upravljanje</w:t>
-      </w:r>
-      <w:proofErr w:type="spellEnd"/>
-      <w:r>
-        <w:t xml:space="preserve"> </w:t>
-      </w:r>
-      <w:proofErr w:type="spellStart"/>
-      <w:r>
-        <w:t>šablonskim</w:t>
-      </w:r>
-      <w:proofErr w:type="spellEnd"/>
-      <w:r>
-        <w:t xml:space="preserve"> </w:t>
-      </w:r>
-      <w:proofErr w:type="spellStart"/>
-      <w:r>
-        <w:t>odgovorima</w:t>
+      <w:r>
+        <w:t>Upravljanje šablonskim odgovorima</w:t>
       </w:r>
       <w:bookmarkEnd w:id="29"/>
-      <w:proofErr w:type="spellEnd"/>
     </w:p>
     <w:p>
       <w:pPr>
@@ -11219,28 +10494,10 @@
         <w:pStyle w:val="Heading2"/>
       </w:pPr>
       <w:bookmarkStart w:id="30" w:name="_Toc229341737"/>
-      <w:proofErr w:type="spellStart"/>
-      <w:r>
-        <w:t>Upravljanje</w:t>
-      </w:r>
-      <w:proofErr w:type="spellEnd"/>
-      <w:r>
-        <w:t xml:space="preserve"> </w:t>
-      </w:r>
-      <w:proofErr w:type="spellStart"/>
-      <w:r>
-        <w:t>kategorijama</w:t>
-      </w:r>
-      <w:proofErr w:type="spellEnd"/>
-      <w:r>
-        <w:t xml:space="preserve"> </w:t>
-      </w:r>
-      <w:proofErr w:type="spellStart"/>
-      <w:r>
-        <w:t>pitanja</w:t>
+      <w:r>
+        <w:t>Upravljanje kategorijama pitanja</w:t>
       </w:r>
       <w:bookmarkEnd w:id="30"/>
-      <w:proofErr w:type="spellEnd"/>
     </w:p>
     <w:p>
       <w:pPr>
@@ -12278,7 +11535,6 @@
         <w:sz w:val="36"/>
       </w:rPr>
     </w:pPr>
-    <w:proofErr w:type="spellStart"/>
     <w:r>
       <w:rPr>
         <w:rFonts w:ascii="Arial" w:hAnsi="Arial"/>
@@ -12287,7 +11543,6 @@
       </w:rPr>
       <w:t>SkodaObozavaoci</w:t>
     </w:r>
-    <w:proofErr w:type="spellEnd"/>
   </w:p>
   <w:p>
     <w:pPr>
@@ -15314,6 +14569,7 @@
   <w:style w:type="character" w:default="1" w:styleId="DefaultParagraphFont">
     <w:name w:val="Default Paragraph Font"/>
     <w:uiPriority w:val="1"/>
+    <w:semiHidden/>
     <w:unhideWhenUsed/>
   </w:style>
   <w:style w:type="table" w:default="1" w:styleId="TableNormal">

</xml_diff>

<commit_message>
Dokumentacija: Specifikacija zahteva, fix: Opseg dokumenta
</commit_message>
<xml_diff>
--- a/Dokumentacija/D04_Spec_Zahteva.docx
+++ b/Dokumentacija/D04_Spec_Zahteva.docx
@@ -3965,31 +3965,19 @@
         <w:rPr>
           <w:lang w:val="sr-Latn-CS"/>
         </w:rPr>
-        <w:t>-a.</w:t>
-      </w:r>
-      <w:r>
-        <w:rPr>
-          <w:lang w:val="sr-Latn-CS"/>
-        </w:rPr>
-        <w:t xml:space="preserve"> </w:t>
-      </w:r>
-      <w:r>
-        <w:rPr>
-          <w:lang w:val="sr-Latn-CS"/>
-        </w:rPr>
-        <w:t xml:space="preserve">Namena sistema </w:t>
-      </w:r>
-      <w:r>
-        <w:rPr>
-          <w:lang w:val="sr-Latn-CS"/>
-        </w:rPr>
-        <w:t xml:space="preserve">je efikasno prezentovanje, kreiranje i održavanje sadržaja vezanih za rad </w:t>
-      </w:r>
-      <w:r>
-        <w:rPr>
-          <w:lang w:val="sr-Latn-CS"/>
-        </w:rPr>
-        <w:t>jedne naučno-istraživačke laboratorije.</w:t>
+        <w:t>-a</w:t>
+      </w:r>
+      <w:r>
+        <w:rPr>
+          <w:lang w:val="sr-Latn-CS"/>
+        </w:rPr>
+        <w:t>, koji služi za brzu i jednostavnu korisničku podršku</w:t>
+      </w:r>
+      <w:r>
+        <w:rPr>
+          <w:lang w:val="sr-Latn-CS"/>
+        </w:rPr>
+        <w:t>.</w:t>
       </w:r>
     </w:p>
     <w:p>

</xml_diff>